<commit_message>
Add Media Lab AI Studio to coursework and NANDA project label
Co-Authored-By: Claude Opus 5.5 <noreply@anthropic.com>
Claude-Session: https://claude.ai/code/session_013R6aTonsDnNH7DBP3ULsZu
</commit_message>
<xml_diff>
--- a/Yaninek_Zachary_MBAn2027_Resume.docx
+++ b/Yaninek_Zachary_MBAn2027_Resume.docx
@@ -165,7 +165,7 @@
           <w:sz w:val="20"/>
           <w:szCs w:val="20"/>
         </w:rPr>
-        <w:t xml:space="preserve">Coursework: Machine Learning, Optimization Methods, Advanced Analytics Edge, Analytics Lab</w:t>
+        <w:t xml:space="preserve">Coursework: Machine Learning, Optimization Methods, Advanced Analytics Edge, Analytics Lab, AI Studio</w:t>
       </w:r>
     </w:p>
     <w:p>
@@ -211,7 +211,7 @@
           <w:sz w:val="20"/>
           <w:szCs w:val="20"/>
         </w:rPr>
-        <w:t xml:space="preserve">AI Agent Project (MIT AI Studio): Designed NANDA Town multi-agent fault test; all messages from 1 of 4 agents arrived garbled, yet both validators passed, checking what was sent, not what arrived; opened pull request proposing fix</w:t>
+        <w:t xml:space="preserve">AI Agent Project (MIT Media Lab AI Studio): Designed NANDA Town multi-agent fault test; all messages from 1 of 4 agents arrived garbled, yet both validators passed, checking what was sent, not what arrived; opened PR proposing fix</w:t>
       </w:r>
     </w:p>
     <w:p>

</xml_diff>

<commit_message>
Name Python and bench work in the Institut Pasteur bullet
Co-Authored-By: Claude Opus 5.5 <noreply@anthropic.com>
Claude-Session: https://claude.ai/code/session_013R6aTonsDnNH7DBP3ULsZu
</commit_message>
<xml_diff>
--- a/Yaninek_Zachary_MBAn2027_Resume.docx
+++ b/Yaninek_Zachary_MBAn2027_Resume.docx
@@ -853,7 +853,7 @@
           <w:sz w:val="20"/>
           <w:szCs w:val="20"/>
         </w:rPr>
-        <w:t xml:space="preserve">Modeled </w:t>
+        <w:t xml:space="preserve">Investigated </w:t>
       </w:r>
       <w:r>
         <w:rPr>
@@ -868,7 +868,7 @@
           <w:sz w:val="20"/>
           <w:szCs w:val="20"/>
         </w:rPr>
-        <w:t xml:space="preserve"> infection progression within host and investigated virulence genes in wet lab</w:t>
+        <w:t xml:space="preserve"> virulence genes at bench; modeled host infection, analyzed data in Python</w:t>
       </w:r>
     </w:p>
     <w:p>

</xml_diff>

<commit_message>
Apply VMock feedback batch 1: Princeton lines, grant placement, GPA, interests
Co-Authored-By: Claude Opus 5.5 <noreply@anthropic.com>
Claude-Session: https://claude.ai/code/session_013R6aTonsDnNH7DBP3ULsZu
</commit_message>
<xml_diff>
--- a/Yaninek_Zachary_MBAn2027_Resume.docx
+++ b/Yaninek_Zachary_MBAn2027_Resume.docx
@@ -283,7 +283,7 @@
           <w:sz w:val="20"/>
           <w:szCs w:val="20"/>
         </w:rPr>
-        <w:t xml:space="preserve">B.S.E. in Operations Research and Financial Engineering, summa cum laude, GPA 3.96/4.00</w:t>
+        <w:t xml:space="preserve">B.S.E. in Operations Research and Financial Engineering, summa cum laude</w:t>
       </w:r>
       <w:r>
         <w:rPr>
@@ -337,38 +337,7 @@
           <w:sz w:val="20"/>
           <w:szCs w:val="20"/>
         </w:rPr>
-        <w:t xml:space="preserve">Teaching: Undergraduate Course Assistant for calculus and linear algebra (2024 - 2026); Minor in French</w:t>
-      </w:r>
-    </w:p>
-    <w:p>
-      <w:pPr>
-        <w:pStyle w:val="Heading2"/>
-        <w:keepNext/>
-        <w:tabs>
-          <w:tab w:val="left" w:pos="10250"/>
-        </w:tabs>
-        <w:spacing w:before="420" w:after="20"/>
-        <w:rPr>
-          <w:u w:val="single"/>
-        </w:rPr>
-      </w:pPr>
-      <w:r>
-        <w:rPr>
-          <w:b/>
-          <w:sz w:val="20"/>
-          <w:szCs w:val="20"/>
-          <w:u w:val="single"/>
-        </w:rPr>
-        <w:t xml:space="preserve">TECHNICAL SKILLS</w:t>
-      </w:r>
-      <w:r>
-        <w:rPr>
-          <w:b/>
-          <w:sz w:val="20"/>
-          <w:szCs w:val="20"/>
-          <w:u w:val="single"/>
-        </w:rPr>
-        <w:tab/>
+        <w:t xml:space="preserve">Grant: Princeton ORFE Summer Research Grant (Vijay Kumar Gupta Fund) funded Institut Pasteur internship (2024)</w:t>
       </w:r>
     </w:p>
     <w:p>
@@ -391,7 +360,7 @@
           <w:sz w:val="20"/>
           <w:szCs w:val="20"/>
         </w:rPr>
-        <w:t xml:space="preserve">Machine Learning &amp; Optimization: Python (PyTorch, XGBoost, scikit-learn, Optuna), Gurobi, PyEPO, CVXPY</w:t>
+        <w:t xml:space="preserve">Teaching: Undergraduate Course Assistant for calculus and linear algebra (2024 - 2026)</w:t>
       </w:r>
     </w:p>
     <w:p>
@@ -414,7 +383,7 @@
           <w:sz w:val="20"/>
           <w:szCs w:val="20"/>
         </w:rPr>
-        <w:t xml:space="preserve">Deployment &amp; AI Tools: FastAPI, React, Docker, SQL (SQLite), LLM agents (MCP), Claude Code, Codex</w:t>
+        <w:t xml:space="preserve">Minor: French</w:t>
       </w:r>
     </w:p>
     <w:p>
@@ -436,7 +405,7 @@
           <w:szCs w:val="20"/>
           <w:u w:val="single"/>
         </w:rPr>
-        <w:t xml:space="preserve">EXPERIENCE</w:t>
+        <w:t xml:space="preserve">TECHNICAL SKILLS</w:t>
       </w:r>
       <w:r>
         <w:rPr>
@@ -446,83 +415,6 @@
           <w:u w:val="single"/>
         </w:rPr>
         <w:tab/>
-      </w:r>
-    </w:p>
-    <w:p>
-      <w:pPr>
-        <w:keepNext/>
-        <w:tabs>
-          <w:tab w:val="right" w:pos="10250"/>
-        </w:tabs>
-        <w:spacing w:before="40"/>
-        <w:ind w:left="140"/>
-        <w:rPr>
-          <w:sz w:val="20"/>
-        </w:rPr>
-      </w:pPr>
-      <w:r>
-        <w:rPr>
-          <w:b/>
-          <w:sz w:val="20"/>
-          <w:szCs w:val="20"/>
-        </w:rPr>
-        <w:t xml:space="preserve">TELEOS LABS</w:t>
-      </w:r>
-      <w:r>
-        <w:rPr>
-          <w:sz w:val="20"/>
-          <w:szCs w:val="20"/>
-        </w:rPr>
-        <w:tab/>
-        <w:t xml:space="preserve">Cambridge, MA</w:t>
-      </w:r>
-    </w:p>
-    <w:p>
-      <w:pPr>
-        <w:keepNext/>
-        <w:tabs>
-          <w:tab w:val="right" w:pos="10250"/>
-        </w:tabs>
-        <w:ind w:left="140"/>
-        <w:rPr>
-          <w:sz w:val="20"/>
-        </w:rPr>
-      </w:pPr>
-      <w:r>
-        <w:rPr>
-          <w:sz w:val="20"/>
-          <w:szCs w:val="20"/>
-        </w:rPr>
-        <w:t xml:space="preserve">AI startup giving families one record of aging parent's care across home, hospital, and assisted living</w:t>
-      </w:r>
-      <w:r>
-        <w:rPr>
-          <w:sz w:val="20"/>
-          <w:szCs w:val="20"/>
-        </w:rPr>
-        <w:tab/>
-        <w:t xml:space="preserve">2026 - Present</w:t>
-      </w:r>
-    </w:p>
-    <w:p>
-      <w:pPr>
-        <w:keepNext/>
-        <w:tabs>
-          <w:tab w:val="right" w:pos="10250"/>
-        </w:tabs>
-        <w:ind w:left="140"/>
-        <w:rPr>
-          <w:sz w:val="20"/>
-        </w:rPr>
-      </w:pPr>
-      <w:r>
-        <w:rPr>
-          <w:b/>
-          <w:i/>
-          <w:sz w:val="20"/>
-          <w:szCs w:val="20"/>
-        </w:rPr>
-        <w:t xml:space="preserve">Co-founder &amp; CEO</w:t>
       </w:r>
     </w:p>
     <w:p>
@@ -545,7 +437,7 @@
           <w:sz w:val="20"/>
           <w:szCs w:val="20"/>
         </w:rPr>
-        <w:t xml:space="preserve">Led research interviews with family caregivers and care and health-system professionals; families asked for passive observation over task assignment, which set product's core design</w:t>
+        <w:t xml:space="preserve">Machine Learning &amp; Optimization: Python (PyTorch, XGBoost, scikit-learn, Optuna), Gurobi, PyEPO, CVXPY</w:t>
       </w:r>
     </w:p>
     <w:p>
@@ -568,7 +460,115 @@
           <w:sz w:val="20"/>
           <w:szCs w:val="20"/>
         </w:rPr>
-        <w:t xml:space="preserve">Defined product in which AI agents keep record current from what caregivers and providers already produce, cite source of every entry, and leave access decisions to person or legal representative</w:t>
+        <w:t xml:space="preserve">Deployment &amp; AI Tools: FastAPI, React, Docker, SQL (SQLite), LLM agents (MCP), Claude Code, Codex</w:t>
+      </w:r>
+    </w:p>
+    <w:p>
+      <w:pPr>
+        <w:pStyle w:val="Heading2"/>
+        <w:keepNext/>
+        <w:tabs>
+          <w:tab w:val="left" w:pos="10250"/>
+        </w:tabs>
+        <w:spacing w:before="420" w:after="20"/>
+        <w:rPr>
+          <w:u w:val="single"/>
+        </w:rPr>
+      </w:pPr>
+      <w:r>
+        <w:rPr>
+          <w:b/>
+          <w:sz w:val="20"/>
+          <w:szCs w:val="20"/>
+          <w:u w:val="single"/>
+        </w:rPr>
+        <w:t xml:space="preserve">EXPERIENCE</w:t>
+      </w:r>
+      <w:r>
+        <w:rPr>
+          <w:b/>
+          <w:sz w:val="20"/>
+          <w:szCs w:val="20"/>
+          <w:u w:val="single"/>
+        </w:rPr>
+        <w:tab/>
+      </w:r>
+    </w:p>
+    <w:p>
+      <w:pPr>
+        <w:keepNext/>
+        <w:tabs>
+          <w:tab w:val="right" w:pos="10250"/>
+        </w:tabs>
+        <w:spacing w:before="40"/>
+        <w:ind w:left="140"/>
+        <w:rPr>
+          <w:sz w:val="20"/>
+        </w:rPr>
+      </w:pPr>
+      <w:r>
+        <w:rPr>
+          <w:b/>
+          <w:sz w:val="20"/>
+          <w:szCs w:val="20"/>
+        </w:rPr>
+        <w:t xml:space="preserve">TELEOS LABS</w:t>
+      </w:r>
+      <w:r>
+        <w:rPr>
+          <w:sz w:val="20"/>
+          <w:szCs w:val="20"/>
+        </w:rPr>
+        <w:tab/>
+        <w:t xml:space="preserve">Cambridge, MA</w:t>
+      </w:r>
+    </w:p>
+    <w:p>
+      <w:pPr>
+        <w:keepNext/>
+        <w:tabs>
+          <w:tab w:val="right" w:pos="10250"/>
+        </w:tabs>
+        <w:ind w:left="140"/>
+        <w:rPr>
+          <w:sz w:val="20"/>
+        </w:rPr>
+      </w:pPr>
+      <w:r>
+        <w:rPr>
+          <w:sz w:val="20"/>
+          <w:szCs w:val="20"/>
+        </w:rPr>
+        <w:t xml:space="preserve">AI startup giving families one record of aging parent's care across home, hospital, and assisted living</w:t>
+      </w:r>
+      <w:r>
+        <w:rPr>
+          <w:sz w:val="20"/>
+          <w:szCs w:val="20"/>
+        </w:rPr>
+        <w:tab/>
+        <w:t xml:space="preserve">2026 - Present</w:t>
+      </w:r>
+    </w:p>
+    <w:p>
+      <w:pPr>
+        <w:keepNext/>
+        <w:tabs>
+          <w:tab w:val="right" w:pos="10250"/>
+        </w:tabs>
+        <w:ind w:left="140"/>
+        <w:rPr>
+          <w:sz w:val="20"/>
+        </w:rPr>
+      </w:pPr>
+      <w:r>
+        <w:rPr>
+          <w:b/>
+          <w:i/>
+          <w:sz w:val="20"/>
+          <w:szCs w:val="20"/>
+        </w:rPr>
+        <w:t xml:space="preserve">Co-founder &amp; CEO</w:t>
       </w:r>
     </w:p>
     <w:p>
@@ -591,92 +591,7 @@
           <w:sz w:val="20"/>
           <w:szCs w:val="20"/>
         </w:rPr>
-        <w:t xml:space="preserve">Directed AI coding agents (Claude Code, Codex) to build and deploy synthetic-data prototype from written specs, reviewing every change (Python, SQLite, MCP, Docker)</w:t>
-      </w:r>
-    </w:p>
-    <w:p>
-      <w:pPr>
-        <w:keepNext/>
-        <w:tabs>
-          <w:tab w:val="right" w:pos="10250"/>
-        </w:tabs>
-        <w:spacing w:before="270"/>
-        <w:ind w:left="140"/>
-        <w:rPr>
-          <w:sz w:val="20"/>
-        </w:rPr>
-      </w:pPr>
-      <w:r>
-        <w:rPr>
-          <w:b/>
-          <w:sz w:val="20"/>
-          <w:szCs w:val="20"/>
-        </w:rPr>
-        <w:t xml:space="preserve">PRINCETON UNIVERSITY</w:t>
-      </w:r>
-      <w:r>
-        <w:rPr>
-          <w:sz w:val="20"/>
-          <w:szCs w:val="20"/>
-        </w:rPr>
-        <w:tab/>
-        <w:t xml:space="preserve">Princeton, NJ</w:t>
-      </w:r>
-    </w:p>
-    <w:p>
-      <w:pPr>
-        <w:keepNext/>
-        <w:tabs>
-          <w:tab w:val="right" w:pos="10250"/>
-        </w:tabs>
-        <w:ind w:left="140"/>
-        <w:rPr>
-          <w:sz w:val="20"/>
-        </w:rPr>
-      </w:pPr>
-      <w:r>
-        <w:rPr>
-          <w:sz w:val="20"/>
-          <w:szCs w:val="20"/>
-        </w:rPr>
-        <w:t xml:space="preserve">Machine learning and optimization for scheduling stroke patients' CT scans in neuro ICU</w:t>
-      </w:r>
-      <w:r>
-        <w:rPr>
-          <w:sz w:val="20"/>
-          <w:szCs w:val="20"/>
-        </w:rPr>
-        <w:tab/>
-        <w:t xml:space="preserve">2025 - 2026</w:t>
-      </w:r>
-    </w:p>
-    <w:p>
-      <w:pPr>
-        <w:keepNext/>
-        <w:tabs>
-          <w:tab w:val="right" w:pos="10250"/>
-        </w:tabs>
-        <w:ind w:left="140"/>
-        <w:rPr>
-          <w:sz w:val="20"/>
-        </w:rPr>
-      </w:pPr>
-      <w:r>
-        <w:rPr>
-          <w:b/>
-          <w:i/>
-          <w:sz w:val="20"/>
-          <w:szCs w:val="20"/>
-        </w:rPr>
-        <w:t xml:space="preserve">Senior Thesis Researcher</w:t>
-      </w:r>
-      <w:r>
-        <w:rPr>
-          <w:i/>
-          <w:sz w:val="20"/>
-          <w:szCs w:val="20"/>
-        </w:rPr>
-        <w:t xml:space="preserve"> (Advisor: Prof. Bartolomeo Stellato; in collaboration with Prof. Agni Orfanoudaki, Oxford)</w:t>
+        <w:t xml:space="preserve">Led research interviews with family caregivers and care and health-system professionals; families asked for passive observation over task assignment, which set product's core design</w:t>
       </w:r>
     </w:p>
     <w:p>
@@ -699,7 +614,7 @@
           <w:sz w:val="20"/>
           <w:szCs w:val="20"/>
         </w:rPr>
-        <w:t xml:space="preserve">Lowered decision regret 35% vs MSE-trained network and captured 79.3% of oracle reward vs 68-71% for other ML models by training PyTorch network end-to-end through Gurobi optimizer (decision-focused learning, PyEPO)</w:t>
+        <w:t xml:space="preserve">Defined product in which AI agents keep record current from what caregivers and providers already produce, cite source of every entry, and leave access decisions to person or legal representative</w:t>
       </w:r>
     </w:p>
     <w:p>
@@ -722,7 +637,92 @@
           <w:sz w:val="20"/>
           <w:szCs w:val="20"/>
         </w:rPr>
-        <w:t xml:space="preserve">Simulated 30-patient neuro ICU over 1,000 hours, replaying held-out patients from 674-patient dataset, to evaluate scan policies under scanner breakdown and data drift; tuned models with 60-trial Optuna searches</w:t>
+        <w:t xml:space="preserve">Directed AI coding agents (Claude Code, Codex) to build and deploy synthetic-data prototype from written specs, reviewing every change (Python, SQLite, MCP, Docker)</w:t>
+      </w:r>
+    </w:p>
+    <w:p>
+      <w:pPr>
+        <w:keepNext/>
+        <w:tabs>
+          <w:tab w:val="right" w:pos="10250"/>
+        </w:tabs>
+        <w:spacing w:before="270"/>
+        <w:ind w:left="140"/>
+        <w:rPr>
+          <w:sz w:val="20"/>
+        </w:rPr>
+      </w:pPr>
+      <w:r>
+        <w:rPr>
+          <w:b/>
+          <w:sz w:val="20"/>
+          <w:szCs w:val="20"/>
+        </w:rPr>
+        <w:t xml:space="preserve">PRINCETON UNIVERSITY</w:t>
+      </w:r>
+      <w:r>
+        <w:rPr>
+          <w:sz w:val="20"/>
+          <w:szCs w:val="20"/>
+        </w:rPr>
+        <w:tab/>
+        <w:t xml:space="preserve">Princeton, NJ</w:t>
+      </w:r>
+    </w:p>
+    <w:p>
+      <w:pPr>
+        <w:keepNext/>
+        <w:tabs>
+          <w:tab w:val="right" w:pos="10250"/>
+        </w:tabs>
+        <w:ind w:left="140"/>
+        <w:rPr>
+          <w:sz w:val="20"/>
+        </w:rPr>
+      </w:pPr>
+      <w:r>
+        <w:rPr>
+          <w:sz w:val="20"/>
+          <w:szCs w:val="20"/>
+        </w:rPr>
+        <w:t xml:space="preserve">Machine learning and optimization for scheduling stroke patients' CT scans in neuro ICU</w:t>
+      </w:r>
+      <w:r>
+        <w:rPr>
+          <w:sz w:val="20"/>
+          <w:szCs w:val="20"/>
+        </w:rPr>
+        <w:tab/>
+        <w:t xml:space="preserve">2025 - 2026</w:t>
+      </w:r>
+    </w:p>
+    <w:p>
+      <w:pPr>
+        <w:keepNext/>
+        <w:tabs>
+          <w:tab w:val="right" w:pos="10250"/>
+        </w:tabs>
+        <w:ind w:left="140"/>
+        <w:rPr>
+          <w:sz w:val="20"/>
+        </w:rPr>
+      </w:pPr>
+      <w:r>
+        <w:rPr>
+          <w:b/>
+          <w:i/>
+          <w:sz w:val="20"/>
+          <w:szCs w:val="20"/>
+        </w:rPr>
+        <w:t xml:space="preserve">Senior Thesis Researcher</w:t>
+      </w:r>
+      <w:r>
+        <w:rPr>
+          <w:i/>
+          <w:sz w:val="20"/>
+          <w:szCs w:val="20"/>
+        </w:rPr>
+        <w:t xml:space="preserve"> (Advisor: Prof. Bartolomeo Stellato; in collaboration with Prof. Agni Orfanoudaki, Oxford)</w:t>
       </w:r>
     </w:p>
     <w:p>
@@ -745,92 +745,7 @@
           <w:sz w:val="20"/>
           <w:szCs w:val="20"/>
         </w:rPr>
-        <w:t xml:space="preserve">Adjusted for clinician selection bias in training targets with inverse propensity weighting (scikit-learn)</w:t>
-      </w:r>
-    </w:p>
-    <w:p>
-      <w:pPr>
-        <w:keepNext/>
-        <w:tabs>
-          <w:tab w:val="right" w:pos="10250"/>
-        </w:tabs>
-        <w:spacing w:before="270"/>
-        <w:ind w:left="140"/>
-        <w:rPr>
-          <w:sz w:val="20"/>
-        </w:rPr>
-      </w:pPr>
-      <w:r>
-        <w:rPr>
-          <w:b/>
-          <w:sz w:val="20"/>
-          <w:szCs w:val="20"/>
-        </w:rPr>
-        <w:t xml:space="preserve">INSTITUT PASTEUR</w:t>
-      </w:r>
-      <w:r>
-        <w:rPr>
-          <w:sz w:val="20"/>
-          <w:szCs w:val="20"/>
-        </w:rPr>
-        <w:tab/>
-        <w:t xml:space="preserve">Paris, France</w:t>
-      </w:r>
-    </w:p>
-    <w:p>
-      <w:pPr>
-        <w:keepNext/>
-        <w:tabs>
-          <w:tab w:val="right" w:pos="10250"/>
-        </w:tabs>
-        <w:ind w:left="140"/>
-        <w:rPr>
-          <w:sz w:val="20"/>
-        </w:rPr>
-      </w:pPr>
-      <w:r>
-        <w:rPr>
-          <w:sz w:val="20"/>
-          <w:szCs w:val="20"/>
-        </w:rPr>
-        <w:t xml:space="preserve">French nonprofit biomedical research foundation</w:t>
-      </w:r>
-      <w:r>
-        <w:rPr>
-          <w:sz w:val="20"/>
-          <w:szCs w:val="20"/>
-        </w:rPr>
-        <w:tab/>
-        <w:t xml:space="preserve">Summer 2024</w:t>
-      </w:r>
-    </w:p>
-    <w:p>
-      <w:pPr>
-        <w:keepNext/>
-        <w:tabs>
-          <w:tab w:val="right" w:pos="10250"/>
-        </w:tabs>
-        <w:ind w:left="140"/>
-        <w:rPr>
-          <w:sz w:val="20"/>
-        </w:rPr>
-      </w:pPr>
-      <w:r>
-        <w:rPr>
-          <w:b/>
-          <w:i/>
-          <w:sz w:val="20"/>
-          <w:szCs w:val="20"/>
-        </w:rPr>
-        <w:t xml:space="preserve">Summer Research Intern</w:t>
-      </w:r>
-      <w:r>
-        <w:rPr>
-          <w:i/>
-          <w:sz w:val="20"/>
-          <w:szCs w:val="20"/>
-        </w:rPr>
-        <w:t xml:space="preserve"> (Advisor: Prof. Marc Lecuit, MD)</w:t>
+        <w:t xml:space="preserve">Lowered decision regret 35% vs MSE-trained network and captured 79.3% of oracle reward vs 68-71% for other ML models by training PyTorch network end-to-end through Gurobi optimizer (decision-focused learning, PyEPO)</w:t>
       </w:r>
     </w:p>
     <w:p>
@@ -853,22 +768,7 @@
           <w:sz w:val="20"/>
           <w:szCs w:val="20"/>
         </w:rPr>
-        <w:t xml:space="preserve">Investigated </w:t>
-      </w:r>
-      <w:r>
-        <w:rPr>
-          <w:i/>
-          <w:sz w:val="20"/>
-          <w:szCs w:val="20"/>
-        </w:rPr>
-        <w:t xml:space="preserve">Listeria monocytogenes</w:t>
-      </w:r>
-      <w:r>
-        <w:rPr>
-          <w:sz w:val="20"/>
-          <w:szCs w:val="20"/>
-        </w:rPr>
-        <w:t xml:space="preserve"> virulence genes at bench; modeled host infection, analyzed data in Python</w:t>
+        <w:t xml:space="preserve">Simulated 30-patient neuro ICU over 1,000 hours, replaying held-out patients from 674-patient dataset, to evaluate scan policies under scanner breakdown and data drift; tuned models with 60-trial Optuna searches</w:t>
       </w:r>
     </w:p>
     <w:p>
@@ -891,19 +791,19 @@
           <w:sz w:val="20"/>
           <w:szCs w:val="20"/>
         </w:rPr>
-        <w:t xml:space="preserve">Won Princeton ORFE Summer Research Grant (Vijay Kumar Gupta Fund) covering internship</w:t>
-      </w:r>
-    </w:p>
-    <w:p>
-      <w:pPr>
-        <w:pStyle w:val="Heading2"/>
+        <w:t xml:space="preserve">Adjusted for clinician selection bias in training targets with inverse propensity weighting (scikit-learn)</w:t>
+      </w:r>
+    </w:p>
+    <w:p>
+      <w:pPr>
         <w:keepNext/>
         <w:tabs>
-          <w:tab w:val="left" w:pos="10250"/>
-        </w:tabs>
-        <w:spacing w:before="420" w:after="20"/>
-        <w:rPr>
-          <w:u w:val="single"/>
+          <w:tab w:val="right" w:pos="10250"/>
+        </w:tabs>
+        <w:spacing w:before="270"/>
+        <w:ind w:left="140"/>
+        <w:rPr>
+          <w:sz w:val="20"/>
         </w:rPr>
       </w:pPr>
       <w:r>
@@ -911,18 +811,72 @@
           <w:b/>
           <w:sz w:val="20"/>
           <w:szCs w:val="20"/>
-          <w:u w:val="single"/>
-        </w:rPr>
-        <w:t xml:space="preserve">ADDITIONAL INFORMATION</w:t>
-      </w:r>
+        </w:rPr>
+        <w:t xml:space="preserve">INSTITUT PASTEUR</w:t>
+      </w:r>
+      <w:r>
+        <w:rPr>
+          <w:sz w:val="20"/>
+          <w:szCs w:val="20"/>
+        </w:rPr>
+        <w:tab/>
+        <w:t xml:space="preserve">Paris, France</w:t>
+      </w:r>
+    </w:p>
+    <w:p>
+      <w:pPr>
+        <w:keepNext/>
+        <w:tabs>
+          <w:tab w:val="right" w:pos="10250"/>
+        </w:tabs>
+        <w:ind w:left="140"/>
+        <w:rPr>
+          <w:sz w:val="20"/>
+        </w:rPr>
+      </w:pPr>
+      <w:r>
+        <w:rPr>
+          <w:sz w:val="20"/>
+          <w:szCs w:val="20"/>
+        </w:rPr>
+        <w:t xml:space="preserve">French nonprofit biomedical research foundation</w:t>
+      </w:r>
+      <w:r>
+        <w:rPr>
+          <w:sz w:val="20"/>
+          <w:szCs w:val="20"/>
+        </w:rPr>
+        <w:tab/>
+        <w:t xml:space="preserve">Summer 2024</w:t>
+      </w:r>
+    </w:p>
+    <w:p>
+      <w:pPr>
+        <w:keepNext/>
+        <w:tabs>
+          <w:tab w:val="right" w:pos="10250"/>
+        </w:tabs>
+        <w:ind w:left="140"/>
+        <w:rPr>
+          <w:sz w:val="20"/>
+        </w:rPr>
+      </w:pPr>
       <w:r>
         <w:rPr>
           <w:b/>
-          <w:sz w:val="20"/>
-          <w:szCs w:val="20"/>
-          <w:u w:val="single"/>
-        </w:rPr>
-        <w:tab/>
+          <w:i/>
+          <w:sz w:val="20"/>
+          <w:szCs w:val="20"/>
+        </w:rPr>
+        <w:t xml:space="preserve">Summer Research Intern</w:t>
+      </w:r>
+      <w:r>
+        <w:rPr>
+          <w:i/>
+          <w:sz w:val="20"/>
+          <w:szCs w:val="20"/>
+        </w:rPr>
+        <w:t xml:space="preserve"> (Advisor: Prof. Marc Lecuit, MD)</w:t>
       </w:r>
     </w:p>
     <w:p>
@@ -945,7 +899,22 @@
           <w:sz w:val="20"/>
           <w:szCs w:val="20"/>
         </w:rPr>
-        <w:t xml:space="preserve">Languages: French (fluent)</w:t>
+        <w:t xml:space="preserve">Investigated </w:t>
+      </w:r>
+      <w:r>
+        <w:rPr>
+          <w:i/>
+          <w:sz w:val="20"/>
+          <w:szCs w:val="20"/>
+        </w:rPr>
+        <w:t xml:space="preserve">Listeria monocytogenes</w:t>
+      </w:r>
+      <w:r>
+        <w:rPr>
+          <w:sz w:val="20"/>
+          <w:szCs w:val="20"/>
+        </w:rPr>
+        <w:t xml:space="preserve"> virulence genes through bench work</w:t>
       </w:r>
     </w:p>
     <w:p>
@@ -968,7 +937,38 @@
           <w:sz w:val="20"/>
           <w:szCs w:val="20"/>
         </w:rPr>
-        <w:t xml:space="preserve">Personal Project: Developed portfolio manager suggesting trades for own brokerage account (CVXPY); adding published cost-aware trading rule raised annualized return 6.9% to 8.6%, cut turnover 12.2x to 4.8x/year (2014 - 2026 backtest)</w:t>
+        <w:t xml:space="preserve">Modeled host infection progression and analyzed data in Python</w:t>
+      </w:r>
+    </w:p>
+    <w:p>
+      <w:pPr>
+        <w:pStyle w:val="Heading2"/>
+        <w:keepNext/>
+        <w:tabs>
+          <w:tab w:val="left" w:pos="10250"/>
+        </w:tabs>
+        <w:spacing w:before="420" w:after="20"/>
+        <w:rPr>
+          <w:u w:val="single"/>
+        </w:rPr>
+      </w:pPr>
+      <w:r>
+        <w:rPr>
+          <w:b/>
+          <w:sz w:val="20"/>
+          <w:szCs w:val="20"/>
+          <w:u w:val="single"/>
+        </w:rPr>
+        <w:t xml:space="preserve">ADDITIONAL INFORMATION</w:t>
+      </w:r>
+      <w:r>
+        <w:rPr>
+          <w:b/>
+          <w:sz w:val="20"/>
+          <w:szCs w:val="20"/>
+          <w:u w:val="single"/>
+        </w:rPr>
+        <w:tab/>
       </w:r>
     </w:p>
     <w:p>
@@ -991,7 +991,53 @@
           <w:sz w:val="20"/>
           <w:szCs w:val="20"/>
         </w:rPr>
-        <w:t xml:space="preserve">Interests: Figure skating (U.S. Figure Skating Association National Development Team, 2019 - 2022)</w:t>
+        <w:t xml:space="preserve">Languages: French (fluent)</w:t>
+      </w:r>
+    </w:p>
+    <w:p>
+      <w:pPr>
+        <w:pStyle w:val="ListParagraph"/>
+        <w:numPr>
+          <w:ilvl w:val="0"/>
+          <w:numId w:val="1"/>
+        </w:numPr>
+        <w:tabs>
+          <w:tab w:val="left" w:pos="320"/>
+        </w:tabs>
+        <w:ind w:left="320" w:right="118" w:hanging="180"/>
+        <w:rPr>
+          <w:sz w:val="20"/>
+        </w:rPr>
+      </w:pPr>
+      <w:r>
+        <w:rPr>
+          <w:sz w:val="20"/>
+          <w:szCs w:val="20"/>
+        </w:rPr>
+        <w:t xml:space="preserve">Personal Project: Developed portfolio manager suggesting trades for own brokerage account (CVXPY); adding published cost-aware trading rule raised annualized return 6.9% to 8.6%, cut turnover 12.2x to 4.8x/year (2014 - 2026 backtest)</w:t>
+      </w:r>
+    </w:p>
+    <w:p>
+      <w:pPr>
+        <w:pStyle w:val="ListParagraph"/>
+        <w:numPr>
+          <w:ilvl w:val="0"/>
+          <w:numId w:val="1"/>
+        </w:numPr>
+        <w:tabs>
+          <w:tab w:val="left" w:pos="320"/>
+        </w:tabs>
+        <w:ind w:left="320" w:right="118" w:hanging="180"/>
+        <w:rPr>
+          <w:sz w:val="20"/>
+        </w:rPr>
+      </w:pPr>
+      <w:r>
+        <w:rPr>
+          <w:sz w:val="20"/>
+          <w:szCs w:val="20"/>
+        </w:rPr>
+        <w:t xml:space="preserve">Interests: Figure skater on U.S. Figure Skating Association National Development Team (2019 - 2022)</w:t>
       </w:r>
     </w:p>
     <w:sectPr>

</xml_diff>

<commit_message>
Apply VMock feedback batch 2: Teleos part-time, founder narrative, plainer bullets
Co-Authored-By: Claude Opus 5.5 <noreply@anthropic.com>
Claude-Session: https://claude.ai/code/session_013R6aTonsDnNH7DBP3ULsZu
</commit_message>
<xml_diff>
--- a/Yaninek_Zachary_MBAn2027_Resume.docx
+++ b/Yaninek_Zachary_MBAn2027_Resume.docx
@@ -188,7 +188,7 @@
           <w:sz w:val="20"/>
           <w:szCs w:val="20"/>
         </w:rPr>
-        <w:t xml:space="preserve">Machine Learning Project (MIT Sundai Hack): Built and deployed glucose app; XGBoost R² rose from 0.21 to 0.31 for unseen participants by adding fasting labs to meal log and pre-meal glucose (1,382 meals; FastAPI, React)</w:t>
+        <w:t xml:space="preserve">Machine Learning Project (MIT Sundai Hack): Built and deployed glucose app; XGBoost R² rose from 0.21 to 0.31 for unseen participants by adding fasting labs to meal log and pre-meal glucose (1,382 meals; FastAPI, React, Docker)</w:t>
       </w:r>
     </w:p>
     <w:p>
@@ -570,6 +570,14 @@
         </w:rPr>
         <w:t xml:space="preserve">Co-founder &amp; CEO</w:t>
       </w:r>
+      <w:r>
+        <w:rPr>
+          <w:i/>
+          <w:sz w:val="20"/>
+          <w:szCs w:val="20"/>
+        </w:rPr>
+        <w:t xml:space="preserve"> (Part-time)</w:t>
+      </w:r>
     </w:p>
     <w:p>
       <w:pPr>
@@ -591,7 +599,7 @@
           <w:sz w:val="20"/>
           <w:szCs w:val="20"/>
         </w:rPr>
-        <w:t xml:space="preserve">Led research interviews with family caregivers and care and health-system professionals; families asked for passive observation over task assignment, which set product's core design</w:t>
+        <w:t xml:space="preserve">Founded startup; wrote go/no-go test plan with kill criteria before first interview; built pitch decks and met investors</w:t>
       </w:r>
     </w:p>
     <w:p>
@@ -614,7 +622,7 @@
           <w:sz w:val="20"/>
           <w:szCs w:val="20"/>
         </w:rPr>
-        <w:t xml:space="preserve">Defined product in which AI agents keep record current from what caregivers and providers already produce, cite source of every entry, and leave access decisions to person or legal representative</w:t>
+        <w:t xml:space="preserve">Scripted and led customer interviews with family caregivers and care staff; families rejected apps that assign them tasks or make them log care, so product builds updates from records caregivers already keep</w:t>
       </w:r>
     </w:p>
     <w:p>

</xml_diff>

<commit_message>
Apply VMock feedback batch 3: thesis rewrite, Analytics Lab entry, tighter bullets
Co-Authored-By: Claude Opus 5.5 <noreply@anthropic.com>
Claude-Session: https://claude.ai/code/session_013R6aTonsDnNH7DBP3ULsZu
</commit_message>
<xml_diff>
--- a/Yaninek_Zachary_MBAn2027_Resume.docx
+++ b/Yaninek_Zachary_MBAn2027_Resume.docx
@@ -64,7 +64,7 @@
         <w:tabs>
           <w:tab w:val="left" w:pos="10250"/>
         </w:tabs>
-        <w:spacing w:before="420" w:after="20"/>
+        <w:spacing w:before="200" w:after="20"/>
         <w:rPr>
           <w:u w:val="single"/>
         </w:rPr>
@@ -165,7 +165,7 @@
           <w:sz w:val="20"/>
           <w:szCs w:val="20"/>
         </w:rPr>
-        <w:t xml:space="preserve">Coursework: Machine Learning, Optimization Methods, Advanced Analytics Edge, Analytics Lab, AI Studio</w:t>
+        <w:t xml:space="preserve">Coursework: Machine Learning, Optimization Methods, Advanced Analytics Edge, AI Studio</w:t>
       </w:r>
     </w:p>
     <w:p>
@@ -188,7 +188,7 @@
           <w:sz w:val="20"/>
           <w:szCs w:val="20"/>
         </w:rPr>
-        <w:t xml:space="preserve">Machine Learning Project (MIT Sundai Hack): Built and deployed glucose app; XGBoost R² rose from 0.21 to 0.31 for unseen participants by adding fasting labs to meal log and pre-meal glucose (1,382 meals; FastAPI, React, Docker)</w:t>
+        <w:t xml:space="preserve">Machine Learning Project (MIT Sundai Hack): Built and deployed app showing users smallest meal edit to keep glucose spike risk under target; fasting labs lifted XGBoost R² 0.21 to 0.31 for unseen participants (FastAPI, React, Docker)</w:t>
       </w:r>
     </w:p>
     <w:p>
@@ -211,7 +211,64 @@
           <w:sz w:val="20"/>
           <w:szCs w:val="20"/>
         </w:rPr>
-        <w:t xml:space="preserve">AI Agent Project (MIT Media Lab AI Studio): Designed NANDA Town multi-agent fault test; all messages from 1 of 4 agents arrived garbled, yet both validators passed, checking what was sent, not what arrived; opened PR proposing fix</w:t>
+        <w:t xml:space="preserve">Clubs: MIT Sloan Healthcare Club, MIT Figure Skating Club, Sundai Club</w:t>
+      </w:r>
+    </w:p>
+    <w:p>
+      <w:pPr>
+        <w:keepNext/>
+        <w:tabs>
+          <w:tab w:val="right" w:pos="10250"/>
+        </w:tabs>
+        <w:spacing w:before="120"/>
+        <w:ind w:left="140"/>
+        <w:rPr>
+          <w:sz w:val="20"/>
+        </w:rPr>
+      </w:pPr>
+      <w:r>
+        <w:rPr>
+          <w:b/>
+          <w:sz w:val="20"/>
+          <w:szCs w:val="20"/>
+        </w:rPr>
+        <w:t xml:space="preserve">PRINCETON UNIVERSITY</w:t>
+      </w:r>
+      <w:r>
+        <w:rPr>
+          <w:sz w:val="20"/>
+          <w:szCs w:val="20"/>
+        </w:rPr>
+        <w:tab/>
+        <w:t xml:space="preserve">Princeton, NJ</w:t>
+      </w:r>
+    </w:p>
+    <w:p>
+      <w:pPr>
+        <w:keepNext/>
+        <w:tabs>
+          <w:tab w:val="right" w:pos="10250"/>
+        </w:tabs>
+        <w:ind w:left="140"/>
+        <w:rPr>
+          <w:sz w:val="20"/>
+        </w:rPr>
+      </w:pPr>
+      <w:r>
+        <w:rPr>
+          <w:i/>
+          <w:sz w:val="20"/>
+          <w:szCs w:val="20"/>
+        </w:rPr>
+        <w:t xml:space="preserve">B.S.E. in Operations Research and Financial Engineering, summa cum laude</w:t>
+      </w:r>
+      <w:r>
+        <w:rPr>
+          <w:sz w:val="20"/>
+          <w:szCs w:val="20"/>
+        </w:rPr>
+        <w:tab/>
+        <w:t xml:space="preserve">2022 - 2026</w:t>
       </w:r>
     </w:p>
     <w:p>
@@ -234,64 +291,7 @@
           <w:sz w:val="20"/>
           <w:szCs w:val="20"/>
         </w:rPr>
-        <w:t xml:space="preserve">Clubs: MIT Sloan Healthcare Club, MIT Figure Skating Club, Sundai Club</w:t>
-      </w:r>
-    </w:p>
-    <w:p>
-      <w:pPr>
-        <w:keepNext/>
-        <w:tabs>
-          <w:tab w:val="right" w:pos="10250"/>
-        </w:tabs>
-        <w:spacing w:before="270"/>
-        <w:ind w:left="140"/>
-        <w:rPr>
-          <w:sz w:val="20"/>
-        </w:rPr>
-      </w:pPr>
-      <w:r>
-        <w:rPr>
-          <w:b/>
-          <w:sz w:val="20"/>
-          <w:szCs w:val="20"/>
-        </w:rPr>
-        <w:t xml:space="preserve">PRINCETON UNIVERSITY</w:t>
-      </w:r>
-      <w:r>
-        <w:rPr>
-          <w:sz w:val="20"/>
-          <w:szCs w:val="20"/>
-        </w:rPr>
-        <w:tab/>
-        <w:t xml:space="preserve">Princeton, NJ</w:t>
-      </w:r>
-    </w:p>
-    <w:p>
-      <w:pPr>
-        <w:keepNext/>
-        <w:tabs>
-          <w:tab w:val="right" w:pos="10250"/>
-        </w:tabs>
-        <w:ind w:left="140"/>
-        <w:rPr>
-          <w:sz w:val="20"/>
-        </w:rPr>
-      </w:pPr>
-      <w:r>
-        <w:rPr>
-          <w:i/>
-          <w:sz w:val="20"/>
-          <w:szCs w:val="20"/>
-        </w:rPr>
-        <w:t xml:space="preserve">B.S.E. in Operations Research and Financial Engineering, summa cum laude</w:t>
-      </w:r>
-      <w:r>
-        <w:rPr>
-          <w:sz w:val="20"/>
-          <w:szCs w:val="20"/>
-        </w:rPr>
-        <w:tab/>
-        <w:t xml:space="preserve">2022 - 2026</w:t>
+        <w:t xml:space="preserve">Honors: Phi Beta Kappa, Tau Beta Pi, Sigma Xi, Kenneth H. Condit Prize, Fulbright France grant (declined)</w:t>
       </w:r>
     </w:p>
     <w:p>
@@ -314,7 +314,7 @@
           <w:sz w:val="20"/>
           <w:szCs w:val="20"/>
         </w:rPr>
-        <w:t xml:space="preserve">Honors: Phi Beta Kappa, Tau Beta Pi, Sigma Xi, Kenneth H. Condit Prize, Fulbright France grant (declined)</w:t>
+        <w:t xml:space="preserve">Grant: Princeton ORFE Summer Research Grant (Vijay Kumar Gupta Fund) funded Institut Pasteur internship (2024)</w:t>
       </w:r>
     </w:p>
     <w:p>
@@ -337,7 +337,7 @@
           <w:sz w:val="20"/>
           <w:szCs w:val="20"/>
         </w:rPr>
-        <w:t xml:space="preserve">Grant: Princeton ORFE Summer Research Grant (Vijay Kumar Gupta Fund) funded Institut Pasteur internship (2024)</w:t>
+        <w:t xml:space="preserve">Teaching: Undergraduate Course Assistant for calculus and linear algebra (2024 - 2026)</w:t>
       </w:r>
     </w:p>
     <w:p>
@@ -360,7 +360,38 @@
           <w:sz w:val="20"/>
           <w:szCs w:val="20"/>
         </w:rPr>
-        <w:t xml:space="preserve">Teaching: Undergraduate Course Assistant for calculus and linear algebra (2024 - 2026)</w:t>
+        <w:t xml:space="preserve">Minor: French</w:t>
+      </w:r>
+    </w:p>
+    <w:p>
+      <w:pPr>
+        <w:pStyle w:val="Heading2"/>
+        <w:keepNext/>
+        <w:tabs>
+          <w:tab w:val="left" w:pos="10250"/>
+        </w:tabs>
+        <w:spacing w:before="200" w:after="20"/>
+        <w:rPr>
+          <w:u w:val="single"/>
+        </w:rPr>
+      </w:pPr>
+      <w:r>
+        <w:rPr>
+          <w:b/>
+          <w:sz w:val="20"/>
+          <w:szCs w:val="20"/>
+          <w:u w:val="single"/>
+        </w:rPr>
+        <w:t xml:space="preserve">TECHNICAL SKILLS</w:t>
+      </w:r>
+      <w:r>
+        <w:rPr>
+          <w:b/>
+          <w:sz w:val="20"/>
+          <w:szCs w:val="20"/>
+          <w:u w:val="single"/>
+        </w:rPr>
+        <w:tab/>
       </w:r>
     </w:p>
     <w:p>
@@ -383,38 +414,7 @@
           <w:sz w:val="20"/>
           <w:szCs w:val="20"/>
         </w:rPr>
-        <w:t xml:space="preserve">Minor: French</w:t>
-      </w:r>
-    </w:p>
-    <w:p>
-      <w:pPr>
-        <w:pStyle w:val="Heading2"/>
-        <w:keepNext/>
-        <w:tabs>
-          <w:tab w:val="left" w:pos="10250"/>
-        </w:tabs>
-        <w:spacing w:before="420" w:after="20"/>
-        <w:rPr>
-          <w:u w:val="single"/>
-        </w:rPr>
-      </w:pPr>
-      <w:r>
-        <w:rPr>
-          <w:b/>
-          <w:sz w:val="20"/>
-          <w:szCs w:val="20"/>
-          <w:u w:val="single"/>
-        </w:rPr>
-        <w:t xml:space="preserve">TECHNICAL SKILLS</w:t>
-      </w:r>
-      <w:r>
-        <w:rPr>
-          <w:b/>
-          <w:sz w:val="20"/>
-          <w:szCs w:val="20"/>
-          <w:u w:val="single"/>
-        </w:rPr>
-        <w:tab/>
+        <w:t xml:space="preserve">Machine Learning &amp; Optimization: Python (PyTorch, XGBoost, scikit-learn, Optuna), Gurobi, PyEPO, CVXPY</w:t>
       </w:r>
     </w:p>
     <w:p>
@@ -437,7 +437,123 @@
           <w:sz w:val="20"/>
           <w:szCs w:val="20"/>
         </w:rPr>
-        <w:t xml:space="preserve">Machine Learning &amp; Optimization: Python (PyTorch, XGBoost, scikit-learn, Optuna), Gurobi, PyEPO, CVXPY</w:t>
+        <w:t xml:space="preserve">Deployment &amp; AI Tools: FastAPI, React, Docker, SQL (SQLite), LLM agents (MCP), Claude Code, Codex</w:t>
+      </w:r>
+    </w:p>
+    <w:p>
+      <w:pPr>
+        <w:pStyle w:val="Heading2"/>
+        <w:keepNext/>
+        <w:tabs>
+          <w:tab w:val="left" w:pos="10250"/>
+        </w:tabs>
+        <w:spacing w:before="200" w:after="20"/>
+        <w:rPr>
+          <w:u w:val="single"/>
+        </w:rPr>
+      </w:pPr>
+      <w:r>
+        <w:rPr>
+          <w:b/>
+          <w:sz w:val="20"/>
+          <w:szCs w:val="20"/>
+          <w:u w:val="single"/>
+        </w:rPr>
+        <w:t xml:space="preserve">EXPERIENCE</w:t>
+      </w:r>
+      <w:r>
+        <w:rPr>
+          <w:b/>
+          <w:sz w:val="20"/>
+          <w:szCs w:val="20"/>
+          <w:u w:val="single"/>
+        </w:rPr>
+        <w:tab/>
+      </w:r>
+    </w:p>
+    <w:p>
+      <w:pPr>
+        <w:keepNext/>
+        <w:tabs>
+          <w:tab w:val="right" w:pos="10250"/>
+        </w:tabs>
+        <w:spacing w:before="40"/>
+        <w:ind w:left="140"/>
+        <w:rPr>
+          <w:sz w:val="20"/>
+        </w:rPr>
+      </w:pPr>
+      <w:r>
+        <w:rPr>
+          <w:b/>
+          <w:sz w:val="20"/>
+          <w:szCs w:val="20"/>
+        </w:rPr>
+        <w:t xml:space="preserve">TELEOS LABS</w:t>
+      </w:r>
+      <w:r>
+        <w:rPr>
+          <w:sz w:val="20"/>
+          <w:szCs w:val="20"/>
+        </w:rPr>
+        <w:tab/>
+        <w:t xml:space="preserve">Cambridge, MA</w:t>
+      </w:r>
+    </w:p>
+    <w:p>
+      <w:pPr>
+        <w:keepNext/>
+        <w:tabs>
+          <w:tab w:val="right" w:pos="10250"/>
+        </w:tabs>
+        <w:ind w:left="140"/>
+        <w:rPr>
+          <w:sz w:val="20"/>
+        </w:rPr>
+      </w:pPr>
+      <w:r>
+        <w:rPr>
+          <w:sz w:val="20"/>
+          <w:szCs w:val="20"/>
+        </w:rPr>
+        <w:t xml:space="preserve">AI startup giving families one record of an aging parent's care across home, hospital, and assisted living</w:t>
+      </w:r>
+      <w:r>
+        <w:rPr>
+          <w:sz w:val="20"/>
+          <w:szCs w:val="20"/>
+        </w:rPr>
+        <w:tab/>
+        <w:t xml:space="preserve">2026 - Present</w:t>
+      </w:r>
+    </w:p>
+    <w:p>
+      <w:pPr>
+        <w:keepNext/>
+        <w:tabs>
+          <w:tab w:val="right" w:pos="10250"/>
+        </w:tabs>
+        <w:ind w:left="140"/>
+        <w:rPr>
+          <w:sz w:val="20"/>
+        </w:rPr>
+      </w:pPr>
+      <w:r>
+        <w:rPr>
+          <w:b/>
+          <w:i/>
+          <w:sz w:val="20"/>
+          <w:szCs w:val="20"/>
+        </w:rPr>
+        <w:t xml:space="preserve">Co-founder &amp; CEO</w:t>
+      </w:r>
+      <w:r>
+        <w:rPr>
+          <w:i/>
+          <w:sz w:val="20"/>
+          <w:szCs w:val="20"/>
+        </w:rPr>
+        <w:t xml:space="preserve"> (Part-time)</w:t>
       </w:r>
     </w:p>
     <w:p>
@@ -460,123 +576,7 @@
           <w:sz w:val="20"/>
           <w:szCs w:val="20"/>
         </w:rPr>
-        <w:t xml:space="preserve">Deployment &amp; AI Tools: FastAPI, React, Docker, SQL (SQLite), LLM agents (MCP), Claude Code, Codex</w:t>
-      </w:r>
-    </w:p>
-    <w:p>
-      <w:pPr>
-        <w:pStyle w:val="Heading2"/>
-        <w:keepNext/>
-        <w:tabs>
-          <w:tab w:val="left" w:pos="10250"/>
-        </w:tabs>
-        <w:spacing w:before="420" w:after="20"/>
-        <w:rPr>
-          <w:u w:val="single"/>
-        </w:rPr>
-      </w:pPr>
-      <w:r>
-        <w:rPr>
-          <w:b/>
-          <w:sz w:val="20"/>
-          <w:szCs w:val="20"/>
-          <w:u w:val="single"/>
-        </w:rPr>
-        <w:t xml:space="preserve">EXPERIENCE</w:t>
-      </w:r>
-      <w:r>
-        <w:rPr>
-          <w:b/>
-          <w:sz w:val="20"/>
-          <w:szCs w:val="20"/>
-          <w:u w:val="single"/>
-        </w:rPr>
-        <w:tab/>
-      </w:r>
-    </w:p>
-    <w:p>
-      <w:pPr>
-        <w:keepNext/>
-        <w:tabs>
-          <w:tab w:val="right" w:pos="10250"/>
-        </w:tabs>
-        <w:spacing w:before="40"/>
-        <w:ind w:left="140"/>
-        <w:rPr>
-          <w:sz w:val="20"/>
-        </w:rPr>
-      </w:pPr>
-      <w:r>
-        <w:rPr>
-          <w:b/>
-          <w:sz w:val="20"/>
-          <w:szCs w:val="20"/>
-        </w:rPr>
-        <w:t xml:space="preserve">TELEOS LABS</w:t>
-      </w:r>
-      <w:r>
-        <w:rPr>
-          <w:sz w:val="20"/>
-          <w:szCs w:val="20"/>
-        </w:rPr>
-        <w:tab/>
-        <w:t xml:space="preserve">Cambridge, MA</w:t>
-      </w:r>
-    </w:p>
-    <w:p>
-      <w:pPr>
-        <w:keepNext/>
-        <w:tabs>
-          <w:tab w:val="right" w:pos="10250"/>
-        </w:tabs>
-        <w:ind w:left="140"/>
-        <w:rPr>
-          <w:sz w:val="20"/>
-        </w:rPr>
-      </w:pPr>
-      <w:r>
-        <w:rPr>
-          <w:sz w:val="20"/>
-          <w:szCs w:val="20"/>
-        </w:rPr>
-        <w:t xml:space="preserve">AI startup giving families one record of aging parent's care across home, hospital, and assisted living</w:t>
-      </w:r>
-      <w:r>
-        <w:rPr>
-          <w:sz w:val="20"/>
-          <w:szCs w:val="20"/>
-        </w:rPr>
-        <w:tab/>
-        <w:t xml:space="preserve">2026 - Present</w:t>
-      </w:r>
-    </w:p>
-    <w:p>
-      <w:pPr>
-        <w:keepNext/>
-        <w:tabs>
-          <w:tab w:val="right" w:pos="10250"/>
-        </w:tabs>
-        <w:ind w:left="140"/>
-        <w:rPr>
-          <w:sz w:val="20"/>
-        </w:rPr>
-      </w:pPr>
-      <w:r>
-        <w:rPr>
-          <w:b/>
-          <w:i/>
-          <w:sz w:val="20"/>
-          <w:szCs w:val="20"/>
-        </w:rPr>
-        <w:t xml:space="preserve">Co-founder &amp; CEO</w:t>
-      </w:r>
-      <w:r>
-        <w:rPr>
-          <w:i/>
-          <w:sz w:val="20"/>
-          <w:szCs w:val="20"/>
-        </w:rPr>
-        <w:t xml:space="preserve"> (Part-time)</w:t>
+        <w:t xml:space="preserve">Founded startup; wrote go/no-go test plan with kill criteria before first interview; built pitch decks and met investors</w:t>
       </w:r>
     </w:p>
     <w:p>
@@ -599,7 +599,7 @@
           <w:sz w:val="20"/>
           <w:szCs w:val="20"/>
         </w:rPr>
-        <w:t xml:space="preserve">Founded startup; wrote go/no-go test plan with kill criteria before first interview; built pitch decks and met investors</w:t>
+        <w:t xml:space="preserve">Scripted and led interviews with families and healthcare professionals; families rejected apps that assign tasks or require logging, so designed daily updates drawn from existing care records</w:t>
       </w:r>
     </w:p>
     <w:p>
@@ -622,7 +622,84 @@
           <w:sz w:val="20"/>
           <w:szCs w:val="20"/>
         </w:rPr>
-        <w:t xml:space="preserve">Scripted and led customer interviews with family caregivers and care staff; families rejected apps that assign them tasks or make them log care, so product builds updates from records caregivers already keep</w:t>
+        <w:t xml:space="preserve">Directed AI coding agents (Claude Code, Codex) to build and deploy synthetic-data prototype from written specs, reviewing every change (Python, SQLite, MCP, Docker)</w:t>
+      </w:r>
+    </w:p>
+    <w:p>
+      <w:pPr>
+        <w:keepNext/>
+        <w:tabs>
+          <w:tab w:val="right" w:pos="10250"/>
+        </w:tabs>
+        <w:spacing w:before="120"/>
+        <w:ind w:left="140"/>
+        <w:rPr>
+          <w:sz w:val="20"/>
+        </w:rPr>
+      </w:pPr>
+      <w:r>
+        <w:rPr>
+          <w:b/>
+          <w:sz w:val="20"/>
+          <w:szCs w:val="20"/>
+        </w:rPr>
+        <w:t xml:space="preserve">MIT SLOAN | ROPER IPA</w:t>
+      </w:r>
+      <w:r>
+        <w:rPr>
+          <w:sz w:val="20"/>
+          <w:szCs w:val="20"/>
+        </w:rPr>
+        <w:tab/>
+        <w:t xml:space="preserve">Cambridge, MA</w:t>
+      </w:r>
+    </w:p>
+    <w:p>
+      <w:pPr>
+        <w:keepNext/>
+        <w:tabs>
+          <w:tab w:val="right" w:pos="10250"/>
+        </w:tabs>
+        <w:ind w:left="140"/>
+        <w:rPr>
+          <w:sz w:val="20"/>
+        </w:rPr>
+      </w:pPr>
+      <w:r>
+        <w:rPr>
+          <w:sz w:val="20"/>
+          <w:szCs w:val="20"/>
+        </w:rPr>
+        <w:t xml:space="preserve">Maker of automated scrubs-dispensing machines for hospitals</w:t>
+      </w:r>
+      <w:r>
+        <w:rPr>
+          <w:sz w:val="20"/>
+          <w:szCs w:val="20"/>
+        </w:rPr>
+        <w:tab/>
+        <w:t xml:space="preserve">Fall 2026</w:t>
+      </w:r>
+    </w:p>
+    <w:p>
+      <w:pPr>
+        <w:keepNext/>
+        <w:tabs>
+          <w:tab w:val="right" w:pos="10250"/>
+        </w:tabs>
+        <w:ind w:left="140"/>
+        <w:rPr>
+          <w:sz w:val="20"/>
+        </w:rPr>
+      </w:pPr>
+      <w:r>
+        <w:rPr>
+          <w:b/>
+          <w:i/>
+          <w:sz w:val="20"/>
+          <w:szCs w:val="20"/>
+        </w:rPr>
+        <w:t xml:space="preserve">Analytics Lab Team Member</w:t>
       </w:r>
     </w:p>
     <w:p>
@@ -645,92 +722,7 @@
           <w:sz w:val="20"/>
           <w:szCs w:val="20"/>
         </w:rPr>
-        <w:t xml:space="preserve">Directed AI coding agents (Claude Code, Codex) to build and deploy synthetic-data prototype from written specs, reviewing every change (Python, SQLite, MCP, Docker)</w:t>
-      </w:r>
-    </w:p>
-    <w:p>
-      <w:pPr>
-        <w:keepNext/>
-        <w:tabs>
-          <w:tab w:val="right" w:pos="10250"/>
-        </w:tabs>
-        <w:spacing w:before="270"/>
-        <w:ind w:left="140"/>
-        <w:rPr>
-          <w:sz w:val="20"/>
-        </w:rPr>
-      </w:pPr>
-      <w:r>
-        <w:rPr>
-          <w:b/>
-          <w:sz w:val="20"/>
-          <w:szCs w:val="20"/>
-        </w:rPr>
-        <w:t xml:space="preserve">PRINCETON UNIVERSITY</w:t>
-      </w:r>
-      <w:r>
-        <w:rPr>
-          <w:sz w:val="20"/>
-          <w:szCs w:val="20"/>
-        </w:rPr>
-        <w:tab/>
-        <w:t xml:space="preserve">Princeton, NJ</w:t>
-      </w:r>
-    </w:p>
-    <w:p>
-      <w:pPr>
-        <w:keepNext/>
-        <w:tabs>
-          <w:tab w:val="right" w:pos="10250"/>
-        </w:tabs>
-        <w:ind w:left="140"/>
-        <w:rPr>
-          <w:sz w:val="20"/>
-        </w:rPr>
-      </w:pPr>
-      <w:r>
-        <w:rPr>
-          <w:sz w:val="20"/>
-          <w:szCs w:val="20"/>
-        </w:rPr>
-        <w:t xml:space="preserve">Machine learning and optimization for scheduling stroke patients' CT scans in neuro ICU</w:t>
-      </w:r>
-      <w:r>
-        <w:rPr>
-          <w:sz w:val="20"/>
-          <w:szCs w:val="20"/>
-        </w:rPr>
-        <w:tab/>
-        <w:t xml:space="preserve">2025 - 2026</w:t>
-      </w:r>
-    </w:p>
-    <w:p>
-      <w:pPr>
-        <w:keepNext/>
-        <w:tabs>
-          <w:tab w:val="right" w:pos="10250"/>
-        </w:tabs>
-        <w:ind w:left="140"/>
-        <w:rPr>
-          <w:sz w:val="20"/>
-        </w:rPr>
-      </w:pPr>
-      <w:r>
-        <w:rPr>
-          <w:b/>
-          <w:i/>
-          <w:sz w:val="20"/>
-          <w:szCs w:val="20"/>
-        </w:rPr>
-        <w:t xml:space="preserve">Senior Thesis Researcher</w:t>
-      </w:r>
-      <w:r>
-        <w:rPr>
-          <w:i/>
-          <w:sz w:val="20"/>
-          <w:szCs w:val="20"/>
-        </w:rPr>
-        <w:t xml:space="preserve"> (Advisor: Prof. Bartolomeo Stellato; in collaboration with Prof. Agni Orfanoudaki, Oxford)</w:t>
+        <w:t xml:space="preserve">Verified teammate's SQL pipeline linking client's service tickets to machine event logs: directed Claude Code agents to reproduce ticket figures 3 ways and script full-database re-run (Python, SQLite); all matched for client memo</w:t>
       </w:r>
     </w:p>
     <w:p>
@@ -753,7 +745,7 @@
           <w:sz w:val="20"/>
           <w:szCs w:val="20"/>
         </w:rPr>
-        <w:t xml:space="preserve">Lowered decision regret 35% vs MSE-trained network and captured 79.3% of oracle reward vs 68-71% for other ML models by training PyTorch network end-to-end through Gurobi optimizer (decision-focused learning, PyEPO)</w:t>
+        <w:t xml:space="preserve">Quantified service tickets per machine on fleet list client sent at team's request (Poisson model, bootstrap intervals): busiest models' load mostly reflects fleet size; flagged persistently high customers and machines for field check</w:t>
       </w:r>
     </w:p>
     <w:p>
@@ -776,7 +768,92 @@
           <w:sz w:val="20"/>
           <w:szCs w:val="20"/>
         </w:rPr>
-        <w:t xml:space="preserve">Simulated 30-patient neuro ICU over 1,000 hours, replaying held-out patients from 674-patient dataset, to evaluate scan policies under scanner breakdown and data drift; tuned models with 60-trial Optuna searches</w:t>
+        <w:t xml:space="preserve">Assessed for client whether machine error logs can explain service tickets: ticket's own fault codes appeared in prior week more than in same-machine control week, beyond other faults (pre-specified test; preliminary)</w:t>
+      </w:r>
+    </w:p>
+    <w:p>
+      <w:pPr>
+        <w:keepNext/>
+        <w:tabs>
+          <w:tab w:val="right" w:pos="10250"/>
+        </w:tabs>
+        <w:spacing w:before="120"/>
+        <w:ind w:left="140"/>
+        <w:rPr>
+          <w:sz w:val="20"/>
+        </w:rPr>
+      </w:pPr>
+      <w:r>
+        <w:rPr>
+          <w:b/>
+          <w:sz w:val="20"/>
+          <w:szCs w:val="20"/>
+        </w:rPr>
+        <w:t xml:space="preserve">PRINCETON UNIVERSITY</w:t>
+      </w:r>
+      <w:r>
+        <w:rPr>
+          <w:sz w:val="20"/>
+          <w:szCs w:val="20"/>
+        </w:rPr>
+        <w:tab/>
+        <w:t xml:space="preserve">Princeton, NJ</w:t>
+      </w:r>
+    </w:p>
+    <w:p>
+      <w:pPr>
+        <w:keepNext/>
+        <w:tabs>
+          <w:tab w:val="right" w:pos="10250"/>
+        </w:tabs>
+        <w:ind w:left="140"/>
+        <w:rPr>
+          <w:sz w:val="20"/>
+        </w:rPr>
+      </w:pPr>
+      <w:r>
+        <w:rPr>
+          <w:sz w:val="20"/>
+          <w:szCs w:val="20"/>
+        </w:rPr>
+        <w:t xml:space="preserve">ML and optimization to schedule limited CT scans that catch life-threatening brain swelling after stroke</w:t>
+      </w:r>
+      <w:r>
+        <w:rPr>
+          <w:sz w:val="20"/>
+          <w:szCs w:val="20"/>
+        </w:rPr>
+        <w:tab/>
+        <w:t xml:space="preserve">2025 - 2026</w:t>
+      </w:r>
+    </w:p>
+    <w:p>
+      <w:pPr>
+        <w:keepNext/>
+        <w:tabs>
+          <w:tab w:val="right" w:pos="10250"/>
+        </w:tabs>
+        <w:ind w:left="140"/>
+        <w:rPr>
+          <w:sz w:val="20"/>
+        </w:rPr>
+      </w:pPr>
+      <w:r>
+        <w:rPr>
+          <w:b/>
+          <w:i/>
+          <w:sz w:val="20"/>
+          <w:szCs w:val="20"/>
+        </w:rPr>
+        <w:t xml:space="preserve">Senior Thesis Researcher</w:t>
+      </w:r>
+      <w:r>
+        <w:rPr>
+          <w:i/>
+          <w:sz w:val="20"/>
+          <w:szCs w:val="20"/>
+        </w:rPr>
+        <w:t xml:space="preserve"> (Advisor: Prof. Bartolomeo Stellato; problem and data via Prof. Agni Orfanoudaki, Oxford)</w:t>
       </w:r>
     </w:p>
     <w:p>
@@ -799,92 +876,7 @@
           <w:sz w:val="20"/>
           <w:szCs w:val="20"/>
         </w:rPr>
-        <w:t xml:space="preserve">Adjusted for clinician selection bias in training targets with inverse propensity weighting (scikit-learn)</w:t>
-      </w:r>
-    </w:p>
-    <w:p>
-      <w:pPr>
-        <w:keepNext/>
-        <w:tabs>
-          <w:tab w:val="right" w:pos="10250"/>
-        </w:tabs>
-        <w:spacing w:before="270"/>
-        <w:ind w:left="140"/>
-        <w:rPr>
-          <w:sz w:val="20"/>
-        </w:rPr>
-      </w:pPr>
-      <w:r>
-        <w:rPr>
-          <w:b/>
-          <w:sz w:val="20"/>
-          <w:szCs w:val="20"/>
-        </w:rPr>
-        <w:t xml:space="preserve">INSTITUT PASTEUR</w:t>
-      </w:r>
-      <w:r>
-        <w:rPr>
-          <w:sz w:val="20"/>
-          <w:szCs w:val="20"/>
-        </w:rPr>
-        <w:tab/>
-        <w:t xml:space="preserve">Paris, France</w:t>
-      </w:r>
-    </w:p>
-    <w:p>
-      <w:pPr>
-        <w:keepNext/>
-        <w:tabs>
-          <w:tab w:val="right" w:pos="10250"/>
-        </w:tabs>
-        <w:ind w:left="140"/>
-        <w:rPr>
-          <w:sz w:val="20"/>
-        </w:rPr>
-      </w:pPr>
-      <w:r>
-        <w:rPr>
-          <w:sz w:val="20"/>
-          <w:szCs w:val="20"/>
-        </w:rPr>
-        <w:t xml:space="preserve">French nonprofit biomedical research foundation</w:t>
-      </w:r>
-      <w:r>
-        <w:rPr>
-          <w:sz w:val="20"/>
-          <w:szCs w:val="20"/>
-        </w:rPr>
-        <w:tab/>
-        <w:t xml:space="preserve">Summer 2024</w:t>
-      </w:r>
-    </w:p>
-    <w:p>
-      <w:pPr>
-        <w:keepNext/>
-        <w:tabs>
-          <w:tab w:val="right" w:pos="10250"/>
-        </w:tabs>
-        <w:ind w:left="140"/>
-        <w:rPr>
-          <w:sz w:val="20"/>
-        </w:rPr>
-      </w:pPr>
-      <w:r>
-        <w:rPr>
-          <w:b/>
-          <w:i/>
-          <w:sz w:val="20"/>
-          <w:szCs w:val="20"/>
-        </w:rPr>
-        <w:t xml:space="preserve">Summer Research Intern</w:t>
-      </w:r>
-      <w:r>
-        <w:rPr>
-          <w:i/>
-          <w:sz w:val="20"/>
-          <w:szCs w:val="20"/>
-        </w:rPr>
-        <w:t xml:space="preserve"> (Advisor: Prof. Marc Lecuit, MD)</w:t>
+        <w:t xml:space="preserve">Trained PyTorch network to score which stroke patients most need one of 3 CT slots/hour, grading scores on schedules Gurobi built (PyEPO, Optuna tuning); cut regret (value lost vs hindsight-best schedule) 35% vs squared-error training</w:t>
       </w:r>
     </w:p>
     <w:p>
@@ -907,22 +899,7 @@
           <w:sz w:val="20"/>
           <w:szCs w:val="20"/>
         </w:rPr>
-        <w:t xml:space="preserve">Investigated </w:t>
-      </w:r>
-      <w:r>
-        <w:rPr>
-          <w:i/>
-          <w:sz w:val="20"/>
-          <w:szCs w:val="20"/>
-        </w:rPr>
-        <w:t xml:space="preserve">Listeria monocytogenes</w:t>
-      </w:r>
-      <w:r>
-        <w:rPr>
-          <w:sz w:val="20"/>
-          <w:szCs w:val="20"/>
-        </w:rPr>
-        <w:t xml:space="preserve"> virulence genes through bench work</w:t>
+        <w:t xml:space="preserve">Reweighted rarely scanned cases (scikit-learn logistic regression), as swelling was seen only if clinicians scanned</w:t>
       </w:r>
     </w:p>
     <w:p>
@@ -945,6 +922,152 @@
           <w:sz w:val="20"/>
           <w:szCs w:val="20"/>
         </w:rPr>
+        <w:t xml:space="preserve">Simulated a 30-bed ICU over 1,000 hours, refilling beds from ~100 of 674 real patients kept out of training; network beat 3 other ML models at timing scans, including during a scanner outage; presented to ORFE faculty</w:t>
+      </w:r>
+    </w:p>
+    <w:p>
+      <w:pPr>
+        <w:keepNext/>
+        <w:tabs>
+          <w:tab w:val="right" w:pos="10250"/>
+        </w:tabs>
+        <w:spacing w:before="120"/>
+        <w:ind w:left="140"/>
+        <w:rPr>
+          <w:sz w:val="20"/>
+        </w:rPr>
+      </w:pPr>
+      <w:r>
+        <w:rPr>
+          <w:b/>
+          <w:sz w:val="20"/>
+          <w:szCs w:val="20"/>
+        </w:rPr>
+        <w:t xml:space="preserve">INSTITUT PASTEUR</w:t>
+      </w:r>
+      <w:r>
+        <w:rPr>
+          <w:sz w:val="20"/>
+          <w:szCs w:val="20"/>
+        </w:rPr>
+        <w:tab/>
+        <w:t xml:space="preserve">Paris, France</w:t>
+      </w:r>
+    </w:p>
+    <w:p>
+      <w:pPr>
+        <w:keepNext/>
+        <w:tabs>
+          <w:tab w:val="right" w:pos="10250"/>
+        </w:tabs>
+        <w:ind w:left="140"/>
+        <w:rPr>
+          <w:sz w:val="20"/>
+        </w:rPr>
+      </w:pPr>
+      <w:r>
+        <w:rPr>
+          <w:sz w:val="20"/>
+          <w:szCs w:val="20"/>
+        </w:rPr>
+        <w:t xml:space="preserve">French nonprofit biomedical research foundation</w:t>
+      </w:r>
+      <w:r>
+        <w:rPr>
+          <w:sz w:val="20"/>
+          <w:szCs w:val="20"/>
+        </w:rPr>
+        <w:tab/>
+        <w:t xml:space="preserve">Summer 2024</w:t>
+      </w:r>
+    </w:p>
+    <w:p>
+      <w:pPr>
+        <w:keepNext/>
+        <w:tabs>
+          <w:tab w:val="right" w:pos="10250"/>
+        </w:tabs>
+        <w:ind w:left="140"/>
+        <w:rPr>
+          <w:sz w:val="20"/>
+        </w:rPr>
+      </w:pPr>
+      <w:r>
+        <w:rPr>
+          <w:b/>
+          <w:i/>
+          <w:sz w:val="20"/>
+          <w:szCs w:val="20"/>
+        </w:rPr>
+        <w:t xml:space="preserve">Summer Research Intern</w:t>
+      </w:r>
+      <w:r>
+        <w:rPr>
+          <w:i/>
+          <w:sz w:val="20"/>
+          <w:szCs w:val="20"/>
+        </w:rPr>
+        <w:t xml:space="preserve"> (Advisor: Prof. Marc Lecuit, MD)</w:t>
+      </w:r>
+    </w:p>
+    <w:p>
+      <w:pPr>
+        <w:pStyle w:val="ListParagraph"/>
+        <w:numPr>
+          <w:ilvl w:val="0"/>
+          <w:numId w:val="1"/>
+        </w:numPr>
+        <w:tabs>
+          <w:tab w:val="left" w:pos="320"/>
+        </w:tabs>
+        <w:ind w:left="320" w:right="118" w:hanging="180"/>
+        <w:rPr>
+          <w:sz w:val="20"/>
+        </w:rPr>
+      </w:pPr>
+      <w:r>
+        <w:rPr>
+          <w:sz w:val="20"/>
+          <w:szCs w:val="20"/>
+        </w:rPr>
+        <w:t xml:space="preserve">Investigated </w:t>
+      </w:r>
+      <w:r>
+        <w:rPr>
+          <w:i/>
+          <w:sz w:val="20"/>
+          <w:szCs w:val="20"/>
+        </w:rPr>
+        <w:t xml:space="preserve">Listeria monocytogenes</w:t>
+      </w:r>
+      <w:r>
+        <w:rPr>
+          <w:sz w:val="20"/>
+          <w:szCs w:val="20"/>
+        </w:rPr>
+        <w:t xml:space="preserve"> virulence genes through bench work</w:t>
+      </w:r>
+    </w:p>
+    <w:p>
+      <w:pPr>
+        <w:pStyle w:val="ListParagraph"/>
+        <w:numPr>
+          <w:ilvl w:val="0"/>
+          <w:numId w:val="1"/>
+        </w:numPr>
+        <w:tabs>
+          <w:tab w:val="left" w:pos="320"/>
+        </w:tabs>
+        <w:ind w:left="320" w:right="118" w:hanging="180"/>
+        <w:rPr>
+          <w:sz w:val="20"/>
+        </w:rPr>
+      </w:pPr>
+      <w:r>
+        <w:rPr>
+          <w:sz w:val="20"/>
+          <w:szCs w:val="20"/>
+        </w:rPr>
         <w:t xml:space="preserve">Modeled host infection progression and analyzed data in Python</w:t>
       </w:r>
     </w:p>
@@ -955,7 +1078,7 @@
         <w:tabs>
           <w:tab w:val="left" w:pos="10250"/>
         </w:tabs>
-        <w:spacing w:before="420" w:after="20"/>
+        <w:spacing w:before="200" w:after="20"/>
         <w:rPr>
           <w:u w:val="single"/>
         </w:rPr>

</xml_diff>